<commit_message>
feat: finalizar v1.5.0 com isolamento por conta e documento acadêmico
</commit_message>
<xml_diff>
--- a/docs/academico/Template_trabalho_20_dias.docx
+++ b/docs/academico/Template_trabalho_20_dias.docx
@@ -1,5 +1,127 @@
 
-<file path=word/document.xml><?xml version="1.0" encoding="utf-8"?>
+<file path=docProps\app.xml><?xml version="1.0" encoding="utf-8"?>
+<Properties xmlns="http://schemas.openxmlformats.org/officeDocument/2006/extended-properties" xmlns:vt="http://schemas.openxmlformats.org/officeDocument/2006/docPropsVTypes">
+  <Template>Normal.dotm</Template>
+  <TotalTime>10</TotalTime>
+  <Pages>3</Pages>
+  <Words>431</Words>
+  <Characters>2328</Characters>
+  <Application>Microsoft Office Word</Application>
+  <DocSecurity>0</DocSecurity>
+  <Lines>19</Lines>
+  <Paragraphs>5</Paragraphs>
+  <ScaleCrop>false</ScaleCrop>
+  <Company/>
+  <LinksUpToDate>false</LinksUpToDate>
+  <CharactersWithSpaces>2754</CharactersWithSpaces>
+  <SharedDoc>false</SharedDoc>
+  <HyperlinksChanged>false</HyperlinksChanged>
+  <AppVersion>16.0000</AppVersion>
+</Properties>
+</file>
+
+<file path=docProps\core.xml><?xml version="1.0" encoding="utf-8"?>
+<cp:coreProperties xmlns:cp="http://schemas.openxmlformats.org/package/2006/metadata/core-properties" xmlns:dc="http://purl.org/dc/elements/1.1/" xmlns:dcterms="http://purl.org/dc/terms/" xmlns:dcmitype="http://purl.org/dc/dcmitype/" xmlns:xsi="http://www.w3.org/2001/XMLSchema-instance">
+  <dc:title/>
+  <dc:subject/>
+  <dc:creator>Raul Benites Paradeda</dc:creator>
+  <cp:keywords/>
+  <dc:description/>
+  <cp:lastModifiedBy>Raul Benites Paradeda</cp:lastModifiedBy>
+  <cp:revision>1</cp:revision>
+  <dcterms:created xsi:type="dcterms:W3CDTF">2026-05-26T13:49:00Z</dcterms:created>
+  <dcterms:modified xsi:type="dcterms:W3CDTF">2026-05-26T13:59:00Z</dcterms:modified>
+</cp:coreProperties>
+</file>
+
+<file path=node_texts.txt>&#65279;00: [LOGO DO APLICATIVO AQUI]
+01: (colar imagem da logo ou &#195;&#173;cone do app)
+02: Nome do Aplicativo
+03: Vers&#195;&#163;o: x.y
+04: Ano/Semestre da disciplina: 2026/1 
+05: Autores
+06: Nome Completo (Email institucional)
+07: Nome Completo (Email institucional)
+08: &#226;&#8364;&#166;
+09: Tecnologia(s) Utilizada(s)
+10: Linguagem principal:
+11: Framework / SDK:
+12: Banco de dados (se houver):
+13: Servi&#195;&#167;os externos / APIs (se houver):
+14: Plataforma(s)-alvo
+15: ( ) Android 
+16: ( ) iOS 
+17: ( ) Web mobile 
+18: ( ) PWA 
+19: ( ) Outra: 
+20: __________
+21: Categoria do Aplicativo
+22: Sugest&#195;&#181;es de categoria (marcar uma ou mais): 
+23: ( ) Educa&#195;&#167;&#195;&#163;o 
+24: ( ) Sa&#195;&#186;de & Bem-estar 
+25: ( ) Finan&#195;&#167;as 
+26: ( ) Produtividade 
+27: ( ) Entretenimento 
+28: ( ) Jogos 
+29: ( ) Com&#195;&#169;rcio / Marketplace 
+30: ( ) Social / Comunica&#195;&#167;&#195;&#163;o 
+31: ( ) Mobilidade / Transporte 
+32: ( ) Outra: 
+33: __________
+34: Funcionamento
+35: ( ) Local (sem necessidade de internet) 
+36: ( ) Remoto (depende de servidor/API) 
+37: ( ) H&#195;&#173;brido (parte local, parte remota)
+38: Objetivo do Aplicativo
+39: Explique em 3&#226;&#8364;&#8220;5 linhas qual problema o aplicativo resolve ou qual necessidade atende.
+40: Frase Curta (Pitch)
+41: Uma frase de impacto que resuma o app em uma linha.
+42: Ex.: &#226;&#8364;&#339;Um organizador de estudos em tempo real para alunos do ensino m&#195;&#169;dio.&#226;&#8364;&#157;
+43: Descri&#195;&#167;&#195;&#163;o Detalhada
+44: Descreva o funcionamento do aplicativo de forma mais profunda (de 1/2 a 1 p&#195;&#161;gina), abordando:
+45: Fluxo principal de uso (como o usu&#195;&#161;rio interage com o app)
+46: Principais funcionalidades
+47: Diferenciais em rela&#195;&#167;&#195;&#163;o a solu&#195;&#167;&#195;&#181;es semelhantes (se houver)
+48: Telas do Aplicativo
+49: Inclua 2 ou 3 capturas de tela com uma breve legenda:
+50: Tela X
+51:  &#226;&#8364;&#8220; descri&#195;&#167;&#195;&#163;o r&#195;&#161;pida da fun&#195;&#167;&#195;&#163;o desta tela.
+52: (Inserir imagem aqui)
+53: Tela Y
+54:  &#226;&#8364;&#8220; descri&#195;&#167;&#195;&#163;o r&#195;&#161;pida da fun&#195;&#167;&#195;&#163;o desta tela.
+55: (Inserir imagem aqui)
+56: Tela Z (opcional)
+57:  &#226;&#8364;&#8220; descri&#195;&#167;&#195;&#163;o r&#195;&#161;pida da fun&#195;&#167;&#195;&#163;o desta tela.
+58: (Inserir imagem aqui)
+59: P&#195;&#186;blico-alvo
+60: Descreva em poucas linhas para quem o aplicativo foi desenvolvido (perfil de usu&#195;&#161;rio, faixa et&#195;&#161;ria, contexto de uso, etc.).
+61: Arquitetura e Aspectos T&#195;&#169;cnicos
+62: Descreva de forma breve:
+63: Arquitetura adotada (ex.: MVC, MVVM, Clean Architecture, etc.)
+64: Como &#195;&#169; feito o acesso a dados (local/servidor, cache, etc.)
+65: Bibliotecas ou recursos relevantes utilizados
+66: Limita&#195;&#167;&#195;&#181;es Conhecidas
+67: Liste brevemente pontos que ainda n&#195;&#163;o foram implementados ou que podem causar problemas:
+68: Ex.: &#226;&#8364;&#339;N&#195;&#163;o possui tratamento de erros para falha de conex&#195;&#163;o com a Internet.&#226;&#8364;&#157;
+69: Ex.: &#226;&#8364;&#339;N&#195;&#163;o implementa autentica&#195;&#167;&#195;&#163;o de usu&#195;&#161;rios, todos acessam como visitante.&#226;&#8364;&#157;
+70: Poss&#195;&#173;veis Melhorias e Trabalhos Futuros
+71: Liste ideias de evolu&#195;&#167;&#195;&#163;o do aplicativo:
+72: Ex.: &#226;&#8364;&#339;Adicionar autentica&#195;&#167;&#195;&#163;o com Google/Facebook.&#226;&#8364;&#157;
+73: Ex.: &#226;&#8364;&#339;Criar painel de estat&#195;&#173;sticas para o usu&#195;&#161;rio.&#226;&#8364;&#157;
+74: Status do Projeto
+75: ( ) Prot&#195;&#179;tipo de interface 
+76: ( ) MVP funcional 
+77: ( ) Funcional, com bugs conhecidos 
+78: ( ) Considerado conclu&#195;&#173;do para a disciplina 
+79: Reposit&#195;&#179;rio / C&#195;&#179;digo-Fonte (opcional)
+80: URL do reposit&#195;&#179;rio (GitHub, GitLab, etc.): 
+81: __________________
+82: 
+83: Instru&#195;&#167;&#195;&#181;es b&#195;&#161;sicas de execu&#195;&#167;&#195;&#163;o (se necess&#195;&#161;rio):
+
+</file>
+
+<file path=word\document.xml><?xml version="1.0" encoding="utf-8"?>
 <w:document xmlns:wpc="http://schemas.microsoft.com/office/word/2010/wordprocessingCanvas" xmlns:cx="http://schemas.microsoft.com/office/drawing/2014/chartex" xmlns:cx1="http://schemas.microsoft.com/office/drawing/2015/9/8/chartex" xmlns:cx2="http://schemas.microsoft.com/office/drawing/2015/10/21/chartex" xmlns:cx3="http://schemas.microsoft.com/office/drawing/2016/5/9/chartex" xmlns:cx4="http://schemas.microsoft.com/office/drawing/2016/5/10/chartex" xmlns:cx5="http://schemas.microsoft.com/office/drawing/2016/5/11/chartex" xmlns:cx6="http://schemas.microsoft.com/office/drawing/2016/5/12/chartex" xmlns:cx7="http://schemas.microsoft.com/office/drawing/2016/5/13/chartex" xmlns:cx8="http://schemas.microsoft.com/office/drawing/2016/5/14/chartex" xmlns:mc="http://schemas.openxmlformats.org/markup-compatibility/2006" xmlns:aink="http://schemas.microsoft.com/office/drawing/2016/ink" xmlns:am3d="http://schemas.microsoft.com/office/drawing/2017/model3d" xmlns:o="urn:schemas-microsoft-com:office:office" xmlns:oel="http://schemas.microsoft.com/office/2019/extlst" xmlns:r="http://schemas.openxmlformats.org/officeDocument/2006/relationships" xmlns:m="http://schemas.openxmlformats.org/officeDocument/2006/math" xmlns:v="urn:schemas-microsoft-com:vml" xmlns:wp14="http://schemas.microsoft.com/office/word/2010/wordprocessingDrawing" xmlns:wp="http://schemas.openxmlformats.org/drawingml/2006/wordprocessingDrawing" xmlns:w10="urn:schemas-microsoft-com:office:word" xmlns:w="http://schemas.openxmlformats.org/wordprocessingml/2006/main" xmlns:w14="http://schemas.microsoft.com/office/word/2010/wordml" xmlns:w15="http://schemas.microsoft.com/office/word/2012/wordml" xmlns:w16cex="http://schemas.microsoft.com/office/word/2018/wordml/cex" xmlns:w16cid="http://schemas.microsoft.com/office/word/2016/wordml/cid" xmlns:w16="http://schemas.microsoft.com/office/word/2018/wordml" xmlns:w16du="http://schemas.microsoft.com/office/word/2023/wordml/word16du" xmlns:w16sdtdh="http://schemas.microsoft.com/office/word/2020/wordml/sdtdatahash" xmlns:w16sdtfl="http://schemas.microsoft.com/office/word/2024/wordml/sdtformatlock" xmlns:w16se="http://schemas.microsoft.com/office/word/2015/wordml/symex" xmlns:wpg="http://schemas.microsoft.com/office/word/2010/wordprocessingGroup" xmlns:wpi="http://schemas.microsoft.com/office/word/2010/wordprocessingInk" xmlns:wne="http://schemas.microsoft.com/office/word/2006/wordml" xmlns:wps="http://schemas.microsoft.com/office/word/2010/wordprocessingShape" mc:Ignorable="w14 w15 w16se w16cid w16 w16cex w16sdtdh w16sdtfl w16du wp14">
   <w:body>
     <w:p>
@@ -8,11 +130,11 @@
           <w:b/>
           <w:bCs/>
         </w:rPr>
-        <w:t>[LOGO DO APLICATIVO AQUI]</w:t>
+        <w:t>GARAGETRACK</w:t>
       </w:r>
       <w:r>
         <w:br/>
-        <w:t>(colar imagem da logo ou ícone do app)</w:t>
+        <w:t>Inserir logo oficial do app GarageTrack aqui</w:t>
       </w:r>
     </w:p>
     <w:p>
@@ -27,16 +149,16 @@
           <w:b/>
           <w:bCs/>
         </w:rPr>
-        <w:t>Nome do Aplicativo</w:t>
-      </w:r>
-    </w:p>
-    <w:p>
-      <w:r>
-        <w:t>Versão: x.y</w:t>
+        <w:t>GarageTrack</w:t>
+      </w:r>
+    </w:p>
+    <w:p>
+      <w:r>
+        <w:t>Versao: 1.5.0</w:t>
       </w:r>
       <w:r>
         <w:br/>
-        <w:t xml:space="preserve">Ano/Semestre da disciplina: 2026/1 </w:t>
+        <w:t xml:space="preserve">Ano/Semestre da disciplina: 2026/1</w:t>
       </w:r>
     </w:p>
     <w:p>
@@ -62,7 +184,7 @@
         </w:numPr>
       </w:pPr>
       <w:r>
-        <w:t>Nome Completo (Email institucional)</w:t>
+        <w:t>Integrante 1 (Email institucional) - preencher</w:t>
       </w:r>
     </w:p>
     <w:p>
@@ -73,7 +195,7 @@
         </w:numPr>
       </w:pPr>
       <w:r>
-        <w:t>Nome Completo (Email institucional)</w:t>
+        <w:t>Integrante 2 (Email institucional) - preencher</w:t>
       </w:r>
     </w:p>
     <w:p>
@@ -84,7 +206,8 @@
         </w:numPr>
       </w:pPr>
       <w:r>
-        <w:t>…</w:t>
+        <w:t>
+        </w:t>
       </w:r>
     </w:p>
     <w:p>
@@ -110,7 +233,7 @@
         </w:numPr>
       </w:pPr>
       <w:r>
-        <w:t>Linguagem principal:</w:t>
+        <w:t>Linguagem principal: TypeScript</w:t>
       </w:r>
     </w:p>
     <w:p>
@@ -121,7 +244,7 @@
         </w:numPr>
       </w:pPr>
       <w:r>
-        <w:t>Framework / SDK:</w:t>
+        <w:t>Framework / SDK: React Native com Expo SDK 56</w:t>
       </w:r>
     </w:p>
     <w:p>
@@ -132,7 +255,7 @@
         </w:numPr>
       </w:pPr>
       <w:r>
-        <w:t>Banco de dados (se houver):</w:t>
+        <w:t>Banco de dados (se houver): SQLite local offline-first + Supabase opcional na nuvem</w:t>
       </w:r>
     </w:p>
     <w:p>
@@ -143,7 +266,7 @@
         </w:numPr>
       </w:pPr>
       <w:r>
-        <w:t>Serviços externos / APIs (se houver):</w:t>
+        <w:t>Servicos externos / APIs (se houver): Supabase Auth/Database, Firebase App Distribution, OpenStreetMap Overpass API</w:t>
       </w:r>
     </w:p>
     <w:p>
@@ -169,7 +292,7 @@
         </w:numPr>
       </w:pPr>
       <w:r>
-        <w:t xml:space="preserve">( ) Android </w:t>
+        <w:t xml:space="preserve">(X) Android</w:t>
       </w:r>
     </w:p>
     <w:p>
@@ -180,7 +303,7 @@
         </w:numPr>
       </w:pPr>
       <w:r>
-        <w:t xml:space="preserve">( ) iOS </w:t>
+        <w:t xml:space="preserve">( ) iOS</w:t>
       </w:r>
     </w:p>
     <w:p>
@@ -191,7 +314,7 @@
         </w:numPr>
       </w:pPr>
       <w:r>
-        <w:t xml:space="preserve">( ) Web mobile </w:t>
+        <w:t xml:space="preserve">( ) Web mobile</w:t>
       </w:r>
     </w:p>
     <w:p>
@@ -202,7 +325,7 @@
         </w:numPr>
       </w:pPr>
       <w:r>
-        <w:t xml:space="preserve">( ) PWA </w:t>
+        <w:t xml:space="preserve">( ) PWA</w:t>
       </w:r>
     </w:p>
     <w:p>
@@ -213,7 +336,7 @@
         </w:numPr>
       </w:pPr>
       <w:r>
-        <w:t xml:space="preserve">( ) Outra: </w:t>
+        <w:t xml:space="preserve">( ) Outra:</w:t>
       </w:r>
       <w:r>
         <w:rPr>
@@ -222,7 +345,8 @@
           <w:i/>
           <w:iCs/>
         </w:rPr>
-        <w:t>__________</w:t>
+        <w:t>
+        </w:t>
       </w:r>
     </w:p>
     <w:p>
@@ -242,7 +366,7 @@
     </w:p>
     <w:p>
       <w:r>
-        <w:t xml:space="preserve">Sugestões de categoria (marcar uma ou mais): </w:t>
+        <w:t xml:space="preserve">Sugestoes de categoria (marcar uma ou mais):</w:t>
       </w:r>
     </w:p>
     <w:p>
@@ -253,7 +377,7 @@
         </w:numPr>
       </w:pPr>
       <w:r>
-        <w:t xml:space="preserve">( ) Educação </w:t>
+        <w:t xml:space="preserve">( ) Educacao</w:t>
       </w:r>
     </w:p>
     <w:p>
@@ -264,7 +388,7 @@
         </w:numPr>
       </w:pPr>
       <w:r>
-        <w:t xml:space="preserve">( ) Saúde &amp; Bem-estar </w:t>
+        <w:t xml:space="preserve">( ) Saude &amp; Bem-estar</w:t>
       </w:r>
     </w:p>
     <w:p>
@@ -275,7 +399,7 @@
         </w:numPr>
       </w:pPr>
       <w:r>
-        <w:t xml:space="preserve">( ) Finanças </w:t>
+        <w:t xml:space="preserve">( ) Financas</w:t>
       </w:r>
     </w:p>
     <w:p>
@@ -286,7 +410,7 @@
         </w:numPr>
       </w:pPr>
       <w:r>
-        <w:t xml:space="preserve">( ) Produtividade </w:t>
+        <w:t xml:space="preserve">(X) Produtividade</w:t>
       </w:r>
     </w:p>
     <w:p>
@@ -297,7 +421,7 @@
         </w:numPr>
       </w:pPr>
       <w:r>
-        <w:t xml:space="preserve">( ) Entretenimento </w:t>
+        <w:t xml:space="preserve">( ) Entretenimento</w:t>
       </w:r>
     </w:p>
     <w:p>
@@ -308,7 +432,7 @@
         </w:numPr>
       </w:pPr>
       <w:r>
-        <w:t xml:space="preserve">( ) Jogos </w:t>
+        <w:t xml:space="preserve">( ) Jogos</w:t>
       </w:r>
     </w:p>
     <w:p>
@@ -319,7 +443,7 @@
         </w:numPr>
       </w:pPr>
       <w:r>
-        <w:t xml:space="preserve">( ) Comércio / Marketplace </w:t>
+        <w:t xml:space="preserve">( ) Comercio / Marketplace</w:t>
       </w:r>
     </w:p>
     <w:p>
@@ -331,7 +455,7 @@
       </w:pPr>
       <w:r>
         <w:lastRenderedPageBreak/>
-        <w:t xml:space="preserve">( ) Social / Comunicação </w:t>
+        <w:t xml:space="preserve">( ) Social / Comunicacao</w:t>
       </w:r>
     </w:p>
     <w:p>
@@ -342,7 +466,7 @@
         </w:numPr>
       </w:pPr>
       <w:r>
-        <w:t xml:space="preserve">( ) Mobilidade / Transporte </w:t>
+        <w:t xml:space="preserve">(X) Mobilidade / Transporte</w:t>
       </w:r>
     </w:p>
     <w:p>
@@ -353,7 +477,7 @@
         </w:numPr>
       </w:pPr>
       <w:r>
-        <w:t xml:space="preserve">( ) Outra: </w:t>
+        <w:t xml:space="preserve">( ) Outra:</w:t>
       </w:r>
       <w:r>
         <w:rPr>
@@ -362,7 +486,8 @@
           <w:i/>
           <w:iCs/>
         </w:rPr>
-        <w:t>__________</w:t>
+        <w:t>
+        </w:t>
       </w:r>
     </w:p>
     <w:p>
@@ -388,7 +513,7 @@
         </w:numPr>
       </w:pPr>
       <w:r>
-        <w:t xml:space="preserve">( ) Local (sem necessidade de internet) </w:t>
+        <w:t xml:space="preserve">(X) Local (sem necessidade de internet)</w:t>
       </w:r>
     </w:p>
     <w:p>
@@ -399,7 +524,7 @@
         </w:numPr>
       </w:pPr>
       <w:r>
-        <w:t xml:space="preserve">( ) Remoto (depende de servidor/API) </w:t>
+        <w:t xml:space="preserve">( ) Remoto (depende de servidor/API)</w:t>
       </w:r>
     </w:p>
     <w:p>
@@ -410,7 +535,7 @@
         </w:numPr>
       </w:pPr>
       <w:r>
-        <w:t>( ) Híbrido (parte local, parte remota)</w:t>
+        <w:t>(X) Hibrido (parte local, parte remota)</w:t>
       </w:r>
     </w:p>
     <w:p>
@@ -430,7 +555,7 @@
     </w:p>
     <w:p>
       <w:r>
-        <w:t>Explique em 3–5 linhas qual problema o aplicativo resolve ou qual necessidade atende.</w:t>
+        <w:t>O GarageTrack organiza a manutencao de carros e motos em um unico app, com historico, custos e alertas preventivos. Funciona offline no uso diario e sincroniza com a nuvem quando o usuario desejar.</w:t>
       </w:r>
     </w:p>
     <w:p>
@@ -450,12 +575,12 @@
     </w:p>
     <w:p>
       <w:r>
-        <w:t>Uma frase de impacto que resuma o app em uma linha.</w:t>
-      </w:r>
-    </w:p>
-    <w:p>
-      <w:r>
-        <w:t>Ex.: “Um organizador de estudos em tempo real para alunos do ensino médio.”</w:t>
+        <w:t>GarageTrack: controle completo da manutencao do seu veiculo, online ou offline, sem perder o historico.</w:t>
+      </w:r>
+    </w:p>
+    <w:p>
+      <w:r>
+        <w:t>Ex.: App mobile para registrar manutencoes, custos e vencimentos do veiculo com sincronizacao opcional.</w:t>
       </w:r>
     </w:p>
     <w:p>
@@ -470,12 +595,12 @@
           <w:b/>
           <w:bCs/>
         </w:rPr>
-        <w:t>Descrição Detalhada</w:t>
-      </w:r>
-    </w:p>
-    <w:p>
-      <w:r>
-        <w:t>Descreva o funcionamento do aplicativo de forma mais profunda (de 1/2 a 1 página), abordando:</w:t>
+        <w:t>Descricao Detalhada</w:t>
+      </w:r>
+    </w:p>
+    <w:p>
+      <w:r>
+        <w:t>O GarageTrack foi desenvolvido para resolver a desorganizacao na manutencao veicular. O app centraliza cadastro de veiculos, registro de servicos, custos, alertas por tempo e quilometragem e historico pesquisavel. A arquitetura e offline-first: SQLite local como fonte da verdade e sincronizacao opcional com Supabase. Na versao final 1.5.0 foram implementadas melhorias de consistencia de sync, isolamento de dados por conta e tratamento de cenarios extremos como garagem vazia apos exclusao total.</w:t>
       </w:r>
     </w:p>
     <w:p>
@@ -486,7 +611,7 @@
         </w:numPr>
       </w:pPr>
       <w:r>
-        <w:t>Fluxo principal de uso (como o usuário interage com o app)</w:t>
+        <w:t>Fluxo principal: cadastrar veiculo, registrar manutencao, acompanhar alertas, consultar historico e sincronizar opcionalmente na nuvem.</w:t>
       </w:r>
     </w:p>
     <w:p>
@@ -497,7 +622,7 @@
         </w:numPr>
       </w:pPr>
       <w:r>
-        <w:t>Principais funcionalidades</w:t>
+        <w:t>Principais funcionalidades: CRUD de veiculos, manutencoes com anexos, alertas preventivos, historico com busca, resumo de gastos e sync opcional.</w:t>
       </w:r>
     </w:p>
     <w:p>
@@ -508,7 +633,7 @@
         </w:numPr>
       </w:pPr>
       <w:r>
-        <w:t>Diferenciais em relação a soluções semelhantes (se houver)</w:t>
+        <w:t>Diferenciais: offline-first real, sincronizacao com reconciliacao, foco em manutencao preventiva e experiencia mobile objetiva.</w:t>
       </w:r>
     </w:p>
     <w:p>
@@ -523,7 +648,7 @@
           <w:b/>
           <w:bCs/>
         </w:rPr>
-        <w:t>Telas do Aplicativo</w:t>
+        <w:t>Cadastro/edicao/exclusao de veiculos; registro de manutencao; alertas preventivos por tempo e km; historico com busca e detalhe; custo por categoria; integracao com mapas/oficinas; backup e sincronizacao opcional.</w:t>
       </w:r>
     </w:p>
     <w:p>
@@ -546,11 +671,11 @@
         <w:t>Tela X</w:t>
       </w:r>
       <w:r>
-        <w:t xml:space="preserve"> – descrição rápida da função desta tela.</w:t>
+        <w:t xml:space="preserve"> - Dashboard com resumo do veiculo, proximos vencimentos e indicadores.</w:t>
       </w:r>
       <w:r>
         <w:br/>
-        <w:t>(Inserir imagem aqui)</w:t>
+        <w:t>(Inserir imagem da Dashboard aqui)</w:t>
       </w:r>
     </w:p>
     <w:p>
@@ -568,11 +693,11 @@
         <w:t>Tela Y</w:t>
       </w:r>
       <w:r>
-        <w:t xml:space="preserve"> – descrição rápida da função desta tela.</w:t>
+        <w:t xml:space="preserve"> - Historico com busca e detalhamento completo das manutencoes.</w:t>
       </w:r>
       <w:r>
         <w:br/>
-        <w:t>(Inserir imagem aqui)</w:t>
+        <w:t>(Inserir imagem do Historico aqui)</w:t>
       </w:r>
     </w:p>
     <w:p>
@@ -590,11 +715,11 @@
         <w:t>Tela Z (opcional)</w:t>
       </w:r>
       <w:r>
-        <w:t xml:space="preserve"> – descrição rápida da função desta tela.</w:t>
+        <w:t xml:space="preserve"> - Configuracoes de conta, sincronizacao e gerenciamento de veiculos.</w:t>
       </w:r>
       <w:r>
         <w:br/>
-        <w:t>(Inserir imagem aqui)</w:t>
+        <w:t>(Inserir imagem das Configuracoes aqui)</w:t>
       </w:r>
     </w:p>
     <w:p>
@@ -609,12 +734,12 @@
           <w:b/>
           <w:bCs/>
         </w:rPr>
-        <w:t>Público-alvo</w:t>
-      </w:r>
-    </w:p>
-    <w:p>
-      <w:r>
-        <w:t>Descreva em poucas linhas para quem o aplicativo foi desenvolvido (perfil de usuário, faixa etária, contexto de uso, etc.).</w:t>
+        <w:t>Tela Z (opcional)</w:t>
+      </w:r>
+    </w:p>
+    <w:p>
+      <w:r>
+        <w:t>Publico-alvo: motoristas e motociclistas que precisam controlar manutencao e custos com confiabilidade, inclusive sem internet.</w:t>
       </w:r>
     </w:p>
     <w:p>
@@ -630,12 +755,12 @@
           <w:bCs/>
         </w:rPr>
         <w:lastRenderedPageBreak/>
-        <w:t>Arquitetura e Aspectos Técnicos</w:t>
-      </w:r>
-    </w:p>
-    <w:p>
-      <w:r>
-        <w:t>Descreva de forma breve:</w:t>
+        <w:t>(Inserir imagem aqui)</w:t>
+      </w:r>
+    </w:p>
+    <w:p>
+      <w:r>
+        <w:t>Resumo tecnico do projeto:</w:t>
       </w:r>
     </w:p>
     <w:p>
@@ -646,7 +771,7 @@
         </w:numPr>
       </w:pPr>
       <w:r>
-        <w:t>Arquitetura adotada (ex.: MVC, MVVM, Clean Architecture, etc.)</w:t>
+        <w:t>Arquitetura em camadas: dados (SQLite), dominio (regras puras), apresentacao (UI/contextos) e servicos (nuvem, mapas e recursos nativos).</w:t>
       </w:r>
     </w:p>
     <w:p>
@@ -657,7 +782,7 @@
         </w:numPr>
       </w:pPr>
       <w:r>
-        <w:t>Como é feito o acesso a dados (local/servidor, cache, etc.)</w:t>
+        <w:t>Acesso a dados: persistencia local com SQLite/WAL e sincronizacao opcional com Supabase usando fila, debounce e reconciliacao por usuario.</w:t>
       </w:r>
     </w:p>
     <w:p>
@@ -668,7 +793,7 @@
         </w:numPr>
       </w:pPr>
       <w:r>
-        <w:t>Bibliotecas ou recursos relevantes utilizados</w:t>
+        <w:t>Bibliotecas relevantes: Expo SDK 56, React Native, expo-sqlite, supabase-js, expo-auth-session, expo-web-browser, expo-audio e react-native-maps.</w:t>
       </w:r>
     </w:p>
     <w:p>
@@ -683,12 +808,12 @@
           <w:b/>
           <w:bCs/>
         </w:rPr>
-        <w:t>Limitações Conhecidas</w:t>
-      </w:r>
-    </w:p>
-    <w:p>
-      <w:r>
-        <w:t>Liste brevemente pontos que ainda não foram implementados ou que podem causar problemas:</w:t>
+        <w:t>Arquitetura adotada (ex.: MVC, MVVM, Clean Architecture, etc.)</w:t>
+      </w:r>
+    </w:p>
+    <w:p>
+      <w:r>
+        <w:t>Limitacoes conhecidas: distribuicao para testadores no Firebase exige permissao e associacao explicita da release para cada testador/grupo.</w:t>
       </w:r>
     </w:p>
     <w:p>
@@ -699,7 +824,7 @@
         </w:numPr>
       </w:pPr>
       <w:r>
-        <w:t>Ex.: “Não possui tratamento de erros para falha de conexão com a Internet.”</w:t>
+        <w:t>Ex.: convites do App Distribution precisam ser redistribuidos em cada release para liberar acesso corretamente.</w:t>
       </w:r>
     </w:p>
     <w:p>
@@ -710,7 +835,7 @@
         </w:numPr>
       </w:pPr>
       <w:r>
-        <w:t>Ex.: “Não implementa autenticação de usuários, todos acessam como visitante.”</w:t>
+        <w:t>Ex.: recursos de nuvem dependem da configuracao correta de OAuth, SMTP e politicas RLS.</w:t>
       </w:r>
     </w:p>
     <w:p>
@@ -725,12 +850,12 @@
           <w:b/>
           <w:bCs/>
         </w:rPr>
-        <w:t>Possíveis Melhorias e Trabalhos Futuros</w:t>
-      </w:r>
-    </w:p>
-    <w:p>
-      <w:r>
-        <w:t>Liste ideias de evolução do aplicativo:</w:t>
+        <w:t>Bibliotecas ou recursos relevantes utilizados</w:t>
+      </w:r>
+    </w:p>
+    <w:p>
+      <w:r>
+        <w:t>Evolucao futura: ampliar analytics de custo por periodo e previsao de manutencao com base em uso historico.</w:t>
       </w:r>
     </w:p>
     <w:p>
@@ -741,7 +866,7 @@
         </w:numPr>
       </w:pPr>
       <w:r>
-        <w:t>Ex.: “Adicionar autenticação com Google/Facebook.”</w:t>
+        <w:t>Ex.: adicionar onboarding guiado com veiculo exemplo opcional para novos usuarios.</w:t>
       </w:r>
     </w:p>
     <w:p>
@@ -752,7 +877,7 @@
         </w:numPr>
       </w:pPr>
       <w:r>
-        <w:t>Ex.: “Criar painel de estatísticas para o usuário.”</w:t>
+        <w:t>Ex.: criar dashboard comparativo de gastos entre meses e categorias.</w:t>
       </w:r>
     </w:p>
     <w:p>
@@ -767,7 +892,7 @@
           <w:b/>
           <w:bCs/>
         </w:rPr>
-        <w:t>Status do Projeto</w:t>
+        <w:t>Convites e permissao de releases no Firebase App Distribution exigem processo manual de distribuicao para testadores/grupos.</w:t>
       </w:r>
     </w:p>
     <w:p>
@@ -778,7 +903,7 @@
         </w:numPr>
       </w:pPr>
       <w:r>
-        <w:t xml:space="preserve">( ) Protótipo de interface </w:t>
+        <w:t xml:space="preserve">( ) Prototipo de interface</w:t>
       </w:r>
     </w:p>
     <w:p>
@@ -789,7 +914,7 @@
         </w:numPr>
       </w:pPr>
       <w:r>
-        <w:t xml:space="preserve">( ) MVP funcional </w:t>
+        <w:t xml:space="preserve">( ) MVP funcional</w:t>
       </w:r>
     </w:p>
     <w:p>
@@ -800,7 +925,7 @@
         </w:numPr>
       </w:pPr>
       <w:r>
-        <w:t xml:space="preserve">( ) Funcional, com bugs conhecidos </w:t>
+        <w:t xml:space="preserve">( ) Funcional, com bugs conhecidos</w:t>
       </w:r>
     </w:p>
     <w:p>
@@ -811,7 +936,7 @@
         </w:numPr>
       </w:pPr>
       <w:r>
-        <w:t xml:space="preserve">( ) Considerado concluído para a disciplina </w:t>
+        <w:t xml:space="preserve">(X) Considerado concluido para a disciplina</w:t>
       </w:r>
     </w:p>
     <w:p>
@@ -826,7 +951,7 @@
           <w:b/>
           <w:bCs/>
         </w:rPr>
-        <w:t>Repositório / Código-Fonte (opcional)</w:t>
+        <w:t>Adicionar onboarding guiado com veiculo exemplo opcional e assistente de primeira configuracao.</w:t>
       </w:r>
     </w:p>
     <w:p>
@@ -837,7 +962,7 @@
         </w:numPr>
       </w:pPr>
       <w:r>
-        <w:t xml:space="preserve">URL do repositório (GitHub, GitLab, etc.): </w:t>
+        <w:t xml:space="preserve">URL do repositorio (GitHub, GitLab, etc.):</w:t>
       </w:r>
       <w:r>
         <w:rPr>
@@ -846,7 +971,7 @@
           <w:i/>
           <w:iCs/>
         </w:rPr>
-        <w:t>__________________</w:t>
+        <w:t>https://github.com/Jo0ji1/GarageTrack</w:t>
       </w:r>
       <w:r>
         <w:t xml:space="preserve"> </w:t>
@@ -860,7 +985,7 @@
         </w:numPr>
       </w:pPr>
       <w:r>
-        <w:t>Instruções básicas de execução (se necessário):</w:t>
+        <w:t>Instrucoes basicas: entrar em garage-track-mobile, executar npm install e npm start. Para validar tipagem use npx tsc --noEmit. Para gerar APK use npm run build:apk.</w:t>
       </w:r>
     </w:p>
     <w:sectPr>
@@ -873,7 +998,52 @@
 </w:document>
 </file>
 
-<file path=word/numbering.xml><?xml version="1.0" encoding="utf-8"?>
+<file path=word\fontTable.xml><?xml version="1.0" encoding="utf-8"?>
+<w:fonts xmlns:mc="http://schemas.openxmlformats.org/markup-compatibility/2006" xmlns:r="http://schemas.openxmlformats.org/officeDocument/2006/relationships" xmlns:w="http://schemas.openxmlformats.org/wordprocessingml/2006/main" xmlns:w14="http://schemas.microsoft.com/office/word/2010/wordml" xmlns:w15="http://schemas.microsoft.com/office/word/2012/wordml" xmlns:w16cex="http://schemas.microsoft.com/office/word/2018/wordml/cex" xmlns:w16cid="http://schemas.microsoft.com/office/word/2016/wordml/cid" xmlns:w16="http://schemas.microsoft.com/office/word/2018/wordml" xmlns:w16du="http://schemas.microsoft.com/office/word/2023/wordml/word16du" xmlns:w16sdtdh="http://schemas.microsoft.com/office/word/2020/wordml/sdtdatahash" xmlns:w16sdtfl="http://schemas.microsoft.com/office/word/2024/wordml/sdtformatlock" xmlns:w16se="http://schemas.microsoft.com/office/word/2015/wordml/symex" mc:Ignorable="w14 w15 w16se w16cid w16 w16cex w16sdtdh w16sdtfl w16du">
+  <w:font w:name="Symbol">
+    <w:panose1 w:val="05050102010706020507"/>
+    <w:charset w:val="02"/>
+    <w:family w:val="roman"/>
+    <w:pitch w:val="variable"/>
+    <w:sig w:usb0="00000000" w:usb1="10000000" w:usb2="00000000" w:usb3="00000000" w:csb0="80000000" w:csb1="00000000"/>
+  </w:font>
+  <w:font w:name="Times New Roman">
+    <w:panose1 w:val="02020603050405020304"/>
+    <w:charset w:val="00"/>
+    <w:family w:val="roman"/>
+    <w:pitch w:val="variable"/>
+    <w:sig w:usb0="E0002EFF" w:usb1="C000785B" w:usb2="00000009" w:usb3="00000000" w:csb0="000001FF" w:csb1="00000000"/>
+  </w:font>
+  <w:font w:name="Courier New">
+    <w:panose1 w:val="02070309020205020404"/>
+    <w:charset w:val="00"/>
+    <w:family w:val="modern"/>
+    <w:pitch w:val="fixed"/>
+    <w:sig w:usb0="E0002EFF" w:usb1="C0007843" w:usb2="00000009" w:usb3="00000000" w:csb0="000001FF" w:csb1="00000000"/>
+  </w:font>
+  <w:font w:name="Wingdings">
+    <w:panose1 w:val="05000000000000000000"/>
+    <w:charset w:val="02"/>
+    <w:family w:val="auto"/>
+    <w:pitch w:val="variable"/>
+    <w:sig w:usb0="00000000" w:usb1="10000000" w:usb2="00000000" w:usb3="00000000" w:csb0="80000000" w:csb1="00000000"/>
+  </w:font>
+  <w:font w:name="Aptos">
+    <w:charset w:val="00"/>
+    <w:family w:val="swiss"/>
+    <w:pitch w:val="variable"/>
+    <w:sig w:usb0="20000287" w:usb1="00000003" w:usb2="00000000" w:usb3="00000000" w:csb0="0000019F" w:csb1="00000000"/>
+  </w:font>
+  <w:font w:name="Aptos Display">
+    <w:charset w:val="00"/>
+    <w:family w:val="swiss"/>
+    <w:pitch w:val="variable"/>
+    <w:sig w:usb0="20000287" w:usb1="00000003" w:usb2="00000000" w:usb3="00000000" w:csb0="0000019F" w:csb1="00000000"/>
+  </w:font>
+</w:fonts>
+</file>
+
+<file path=word\numbering.xml><?xml version="1.0" encoding="utf-8"?>
 <w:numbering xmlns:wpc="http://schemas.microsoft.com/office/word/2010/wordprocessingCanvas" xmlns:cx="http://schemas.microsoft.com/office/drawing/2014/chartex" xmlns:cx1="http://schemas.microsoft.com/office/drawing/2015/9/8/chartex" xmlns:cx2="http://schemas.microsoft.com/office/drawing/2015/10/21/chartex" xmlns:cx3="http://schemas.microsoft.com/office/drawing/2016/5/9/chartex" xmlns:cx4="http://schemas.microsoft.com/office/drawing/2016/5/10/chartex" xmlns:cx5="http://schemas.microsoft.com/office/drawing/2016/5/11/chartex" xmlns:cx6="http://schemas.microsoft.com/office/drawing/2016/5/12/chartex" xmlns:cx7="http://schemas.microsoft.com/office/drawing/2016/5/13/chartex" xmlns:cx8="http://schemas.microsoft.com/office/drawing/2016/5/14/chartex" xmlns:mc="http://schemas.openxmlformats.org/markup-compatibility/2006" xmlns:aink="http://schemas.microsoft.com/office/drawing/2016/ink" xmlns:am3d="http://schemas.microsoft.com/office/drawing/2017/model3d" xmlns:o="urn:schemas-microsoft-com:office:office" xmlns:oel="http://schemas.microsoft.com/office/2019/extlst" xmlns:r="http://schemas.openxmlformats.org/officeDocument/2006/relationships" xmlns:m="http://schemas.openxmlformats.org/officeDocument/2006/math" xmlns:v="urn:schemas-microsoft-com:vml" xmlns:wp14="http://schemas.microsoft.com/office/word/2010/wordprocessingDrawing" xmlns:wp="http://schemas.openxmlformats.org/drawingml/2006/wordprocessingDrawing" xmlns:w10="urn:schemas-microsoft-com:office:word" xmlns:w="http://schemas.openxmlformats.org/wordprocessingml/2006/main" xmlns:w14="http://schemas.microsoft.com/office/word/2010/wordml" xmlns:w15="http://schemas.microsoft.com/office/word/2012/wordml" xmlns:w16cex="http://schemas.microsoft.com/office/word/2018/wordml/cex" xmlns:w16cid="http://schemas.microsoft.com/office/word/2016/wordml/cid" xmlns:w16="http://schemas.microsoft.com/office/word/2018/wordml" xmlns:w16du="http://schemas.microsoft.com/office/word/2023/wordml/word16du" xmlns:w16sdtdh="http://schemas.microsoft.com/office/word/2020/wordml/sdtdatahash" xmlns:w16sdtfl="http://schemas.microsoft.com/office/word/2024/wordml/sdtformatlock" xmlns:w16se="http://schemas.microsoft.com/office/word/2015/wordml/symex" xmlns:wpg="http://schemas.microsoft.com/office/word/2010/wordprocessingGroup" xmlns:wpi="http://schemas.microsoft.com/office/word/2010/wordprocessingInk" xmlns:wne="http://schemas.microsoft.com/office/word/2006/wordml" xmlns:wps="http://schemas.microsoft.com/office/word/2010/wordprocessingShape" mc:Ignorable="w14 w15 w16se w16cid w16 w16cex w16sdtdh w16sdtfl w16du wp14">
   <w:abstractNum w:abstractNumId="0" w15:restartNumberingAfterBreak="0">
     <w:nsid w:val="008F2491"/>
@@ -2786,7 +2956,56 @@
 </w:numbering>
 </file>
 
-<file path=word/styles.xml><?xml version="1.0" encoding="utf-8"?>
+<file path=word\settings.xml><?xml version="1.0" encoding="utf-8"?>
+<w:settings xmlns:mc="http://schemas.openxmlformats.org/markup-compatibility/2006" xmlns:o="urn:schemas-microsoft-com:office:office" xmlns:r="http://schemas.openxmlformats.org/officeDocument/2006/relationships" xmlns:m="http://schemas.openxmlformats.org/officeDocument/2006/math" xmlns:v="urn:schemas-microsoft-com:vml" xmlns:w10="urn:schemas-microsoft-com:office:word" xmlns:w="http://schemas.openxmlformats.org/wordprocessingml/2006/main" xmlns:w14="http://schemas.microsoft.com/office/word/2010/wordml" xmlns:w15="http://schemas.microsoft.com/office/word/2012/wordml" xmlns:w16cex="http://schemas.microsoft.com/office/word/2018/wordml/cex" xmlns:w16cid="http://schemas.microsoft.com/office/word/2016/wordml/cid" xmlns:w16="http://schemas.microsoft.com/office/word/2018/wordml" xmlns:w16du="http://schemas.microsoft.com/office/word/2023/wordml/word16du" xmlns:w16sdtdh="http://schemas.microsoft.com/office/word/2020/wordml/sdtdatahash" xmlns:w16sdtfl="http://schemas.microsoft.com/office/word/2024/wordml/sdtformatlock" xmlns:w16se="http://schemas.microsoft.com/office/word/2015/wordml/symex" xmlns:sl="http://schemas.openxmlformats.org/schemaLibrary/2006/main" mc:Ignorable="w14 w15 w16se w16cid w16 w16cex w16sdtdh w16sdtfl w16du">
+  <w:zoom w:percent="100"/>
+  <w:proofState w:spelling="clean" w:grammar="clean"/>
+  <w:defaultTabStop w:val="708"/>
+  <w:hyphenationZone w:val="425"/>
+  <w:characterSpacingControl w:val="doNotCompress"/>
+  <w:compat>
+    <w:compatSetting w:name="compatibilityMode" w:uri="http://schemas.microsoft.com/office/word" w:val="15"/>
+    <w:compatSetting w:name="overrideTableStyleFontSizeAndJustification" w:uri="http://schemas.microsoft.com/office/word" w:val="1"/>
+    <w:compatSetting w:name="enableOpenTypeFeatures" w:uri="http://schemas.microsoft.com/office/word" w:val="1"/>
+    <w:compatSetting w:name="doNotFlipMirrorIndents" w:uri="http://schemas.microsoft.com/office/word" w:val="1"/>
+    <w:compatSetting w:name="differentiateMultirowTableHeaders" w:uri="http://schemas.microsoft.com/office/word" w:val="1"/>
+    <w:compatSetting w:name="useWord2013TrackBottomHyphenation" w:uri="http://schemas.microsoft.com/office/word" w:val="0"/>
+  </w:compat>
+  <w:rsids>
+    <w:rsidRoot w:val="00C96D42"/>
+    <w:rsid w:val="000C1533"/>
+    <w:rsid w:val="00C96D42"/>
+  </w:rsids>
+  <m:mathPr>
+    <m:mathFont m:val="Cambria Math"/>
+    <m:brkBin m:val="before"/>
+    <m:brkBinSub m:val="--"/>
+    <m:smallFrac m:val="0"/>
+    <m:dispDef/>
+    <m:lMargin m:val="0"/>
+    <m:rMargin m:val="0"/>
+    <m:defJc m:val="centerGroup"/>
+    <m:wrapIndent m:val="1440"/>
+    <m:intLim m:val="subSup"/>
+    <m:naryLim m:val="undOvr"/>
+  </m:mathPr>
+  <w:themeFontLang w:val="pt-BR"/>
+  <w:clrSchemeMapping w:bg1="light1" w:t1="dark1" w:bg2="light2" w:t2="dark2" w:accent1="accent1" w:accent2="accent2" w:accent3="accent3" w:accent4="accent4" w:accent5="accent5" w:accent6="accent6" w:hyperlink="hyperlink" w:followedHyperlink="followedHyperlink"/>
+  <w:shapeDefaults>
+    <o:shapedefaults v:ext="edit" spidmax="1026"/>
+    <o:shapelayout v:ext="edit">
+      <o:idmap v:ext="edit" data="1"/>
+    </o:shapelayout>
+  </w:shapeDefaults>
+  <w:decimalSymbol w:val=","/>
+  <w:listSeparator w:val=";"/>
+  <w14:docId w14:val="73F4D6BB"/>
+  <w15:chartTrackingRefBased/>
+  <w15:docId w15:val="{69E3D2AB-6886-4AB3-B913-3F802BDF702D}"/>
+</w:settings>
+</file>
+
+<file path=word\styles.xml><?xml version="1.0" encoding="utf-8"?>
 <w:styles xmlns:mc="http://schemas.openxmlformats.org/markup-compatibility/2006" xmlns:r="http://schemas.openxmlformats.org/officeDocument/2006/relationships" xmlns:w="http://schemas.openxmlformats.org/wordprocessingml/2006/main" xmlns:w14="http://schemas.microsoft.com/office/word/2010/wordml" xmlns:w15="http://schemas.microsoft.com/office/word/2012/wordml" xmlns:w16cex="http://schemas.microsoft.com/office/word/2018/wordml/cex" xmlns:w16cid="http://schemas.microsoft.com/office/word/2016/wordml/cid" xmlns:w16="http://schemas.microsoft.com/office/word/2018/wordml" xmlns:w16du="http://schemas.microsoft.com/office/word/2023/wordml/word16du" xmlns:w16sdtdh="http://schemas.microsoft.com/office/word/2020/wordml/sdtdatahash" xmlns:w16sdtfl="http://schemas.microsoft.com/office/word/2024/wordml/sdtformatlock" xmlns:w16se="http://schemas.microsoft.com/office/word/2015/wordml/symex" mc:Ignorable="w14 w15 w16se w16cid w16 w16cex w16sdtdh w16sdtfl w16du">
   <w:docDefaults>
     <w:rPrDefault>
@@ -3705,7 +3924,7 @@
 </w:styles>
 </file>
 
-<file path=word/theme/theme1.xml><?xml version="1.0" encoding="utf-8"?>
+<file path=word\theme\theme1.xml><?xml version="1.0" encoding="utf-8"?>
 <a:theme xmlns:a="http://schemas.openxmlformats.org/drawingml/2006/main" name="Office Theme">
   <a:themeElements>
     <a:clrScheme name="Office">
@@ -4018,4 +4237,11 @@
     </a:ext>
   </a:extLst>
 </a:theme>
+</file>
+
+<file path=word\webSettings.xml><?xml version="1.0" encoding="utf-8"?>
+<w:webSettings xmlns:mc="http://schemas.openxmlformats.org/markup-compatibility/2006" xmlns:r="http://schemas.openxmlformats.org/officeDocument/2006/relationships" xmlns:w="http://schemas.openxmlformats.org/wordprocessingml/2006/main" xmlns:w14="http://schemas.microsoft.com/office/word/2010/wordml" xmlns:w15="http://schemas.microsoft.com/office/word/2012/wordml" xmlns:w16cex="http://schemas.microsoft.com/office/word/2018/wordml/cex" xmlns:w16cid="http://schemas.microsoft.com/office/word/2016/wordml/cid" xmlns:w16="http://schemas.microsoft.com/office/word/2018/wordml" xmlns:w16du="http://schemas.microsoft.com/office/word/2023/wordml/word16du" xmlns:w16sdtdh="http://schemas.microsoft.com/office/word/2020/wordml/sdtdatahash" xmlns:w16sdtfl="http://schemas.microsoft.com/office/word/2024/wordml/sdtformatlock" xmlns:w16se="http://schemas.microsoft.com/office/word/2015/wordml/symex" mc:Ignorable="w14 w15 w16se w16cid w16 w16cex w16sdtdh w16sdtfl w16du">
+  <w:optimizeForBrowser/>
+  <w:allowPNG/>
+</w:webSettings>
 </file>
</xml_diff>